<commit_message>
Step: Reconfigure view and controller to render view
</commit_message>
<xml_diff>
--- a/Hệ thống thương mai điện tử verison 1.docx
+++ b/Hệ thống thương mai điện tử verison 1.docx
@@ -29,8 +29,6 @@
           <w:tab w:val="right" w:leader="dot" w:pos="9689"/>
         </w:tabs>
       </w:pPr>
-      <w:bookmarkStart w:id="101" w:name="_GoBack"/>
-      <w:bookmarkEnd w:id="101"/>
       <w:r>
         <w:fldChar w:fldCharType="begin"/>
       </w:r>
@@ -11782,6 +11780,12 @@
             <w:insideH w:val="single" w:color="auto" w:sz="4" w:space="0"/>
             <w:insideV w:val="single" w:color="auto" w:sz="4" w:space="0"/>
           </w:tblBorders>
+          <w:tblCellMar>
+            <w:top w:w="0" w:type="dxa"/>
+            <w:left w:w="108" w:type="dxa"/>
+            <w:bottom w:w="0" w:type="dxa"/>
+            <w:right w:w="108" w:type="dxa"/>
+          </w:tblCellMar>
         </w:tblPrEx>
         <w:tc>
           <w:tcPr>
@@ -12053,19 +12057,11 @@
     </w:tbl>
     <w:p>
       <w:pPr>
-        <w:bidi w:val="0"/>
-      </w:pPr>
-    </w:p>
-    <w:p>
-      <w:r>
-        <w:br w:type="page"/>
-      </w:r>
-    </w:p>
-    <w:p>
-      <w:pPr>
         <w:pStyle w:val="3"/>
         <w:bidi w:val="0"/>
       </w:pPr>
+      <w:bookmarkStart w:id="101" w:name="_GoBack"/>
+      <w:bookmarkEnd w:id="101"/>
       <w:bookmarkStart w:id="23" w:name="_Toc2190"/>
       <w:r>
         <w:t>3.7. Trang đăng nhập</w:t>
@@ -13820,6 +13816,12 @@
             <w:insideH w:val="single" w:color="auto" w:sz="4" w:space="0"/>
             <w:insideV w:val="single" w:color="auto" w:sz="4" w:space="0"/>
           </w:tblBorders>
+          <w:tblCellMar>
+            <w:top w:w="0" w:type="dxa"/>
+            <w:left w:w="108" w:type="dxa"/>
+            <w:bottom w:w="0" w:type="dxa"/>
+            <w:right w:w="108" w:type="dxa"/>
+          </w:tblCellMar>
         </w:tblPrEx>
         <w:tc>
           <w:tcPr>
@@ -16446,6 +16448,12 @@
             <w:insideH w:val="single" w:color="auto" w:sz="4" w:space="0"/>
             <w:insideV w:val="single" w:color="auto" w:sz="4" w:space="0"/>
           </w:tblBorders>
+          <w:tblCellMar>
+            <w:top w:w="0" w:type="dxa"/>
+            <w:left w:w="108" w:type="dxa"/>
+            <w:bottom w:w="0" w:type="dxa"/>
+            <w:right w:w="108" w:type="dxa"/>
+          </w:tblCellMar>
         </w:tblPrEx>
         <w:tc>
           <w:tcPr>
@@ -17218,7 +17226,9 @@
         </w:tblBorders>
         <w:tblLayout w:type="autofit"/>
         <w:tblCellMar>
+          <w:top w:w="0" w:type="dxa"/>
           <w:left w:w="108" w:type="dxa"/>
+          <w:bottom w:w="0" w:type="dxa"/>
           <w:right w:w="108" w:type="dxa"/>
         </w:tblCellMar>
       </w:tblPr>
@@ -17236,6 +17246,12 @@
             <w:insideH w:val="single" w:color="auto" w:sz="4" w:space="0"/>
             <w:insideV w:val="single" w:color="auto" w:sz="4" w:space="0"/>
           </w:tblBorders>
+          <w:tblCellMar>
+            <w:top w:w="0" w:type="dxa"/>
+            <w:left w:w="108" w:type="dxa"/>
+            <w:bottom w:w="0" w:type="dxa"/>
+            <w:right w:w="108" w:type="dxa"/>
+          </w:tblCellMar>
         </w:tblPrEx>
         <w:tc>
           <w:tcPr>
@@ -17301,7 +17317,9 @@
             <w:insideV w:val="single" w:color="auto" w:sz="4" w:space="0"/>
           </w:tblBorders>
           <w:tblCellMar>
+            <w:top w:w="0" w:type="dxa"/>
             <w:left w:w="108" w:type="dxa"/>
+            <w:bottom w:w="0" w:type="dxa"/>
             <w:right w:w="108" w:type="dxa"/>
           </w:tblCellMar>
         </w:tblPrEx>
@@ -17355,7 +17373,9 @@
             <w:insideV w:val="single" w:color="auto" w:sz="4" w:space="0"/>
           </w:tblBorders>
           <w:tblCellMar>
+            <w:top w:w="0" w:type="dxa"/>
             <w:left w:w="108" w:type="dxa"/>
+            <w:bottom w:w="0" w:type="dxa"/>
             <w:right w:w="108" w:type="dxa"/>
           </w:tblCellMar>
         </w:tblPrEx>
@@ -17394,56 +17414,6 @@
             </w:pPr>
             <w:r>
               <w:t>Số lượng đơn hàng</w:t>
-            </w:r>
-          </w:p>
-        </w:tc>
-      </w:tr>
-      <w:tr>
-        <w:tblPrEx>
-          <w:tblBorders>
-            <w:top w:val="single" w:color="auto" w:sz="4" w:space="0"/>
-            <w:left w:val="single" w:color="auto" w:sz="4" w:space="0"/>
-            <w:bottom w:val="single" w:color="auto" w:sz="4" w:space="0"/>
-            <w:right w:val="single" w:color="auto" w:sz="4" w:space="0"/>
-            <w:insideH w:val="single" w:color="auto" w:sz="4" w:space="0"/>
-            <w:insideV w:val="single" w:color="auto" w:sz="4" w:space="0"/>
-          </w:tblBorders>
-        </w:tblPrEx>
-        <w:tc>
-          <w:tcPr>
-            <w:tcW w:w="4952" w:type="dxa"/>
-            <w:vAlign w:val="center"/>
-          </w:tcPr>
-          <w:p>
-            <w:pPr>
-              <w:bidi w:val="0"/>
-              <w:rPr>
-                <w:rFonts w:hint="default"/>
-                <w:vertAlign w:val="baseline"/>
-                <w:lang w:val="vi-VN"/>
-              </w:rPr>
-            </w:pPr>
-            <w:r>
-              <w:t>Tổng sản phẩm</w:t>
-            </w:r>
-          </w:p>
-        </w:tc>
-        <w:tc>
-          <w:tcPr>
-            <w:tcW w:w="4953" w:type="dxa"/>
-            <w:vAlign w:val="center"/>
-          </w:tcPr>
-          <w:p>
-            <w:pPr>
-              <w:bidi w:val="0"/>
-              <w:rPr>
-                <w:rFonts w:hint="default"/>
-                <w:vertAlign w:val="baseline"/>
-                <w:lang w:val="vi-VN"/>
-              </w:rPr>
-            </w:pPr>
-            <w:r>
-              <w:t>Số sản phẩm trong hệ thống</w:t>
             </w:r>
           </w:p>
         </w:tc>
@@ -17459,7 +17429,9 @@
             <w:insideV w:val="single" w:color="auto" w:sz="4" w:space="0"/>
           </w:tblBorders>
           <w:tblCellMar>
+            <w:top w:w="0" w:type="dxa"/>
             <w:left w:w="108" w:type="dxa"/>
+            <w:bottom w:w="0" w:type="dxa"/>
             <w:right w:w="108" w:type="dxa"/>
           </w:tblCellMar>
         </w:tblPrEx>
@@ -17478,7 +17450,7 @@
               </w:rPr>
             </w:pPr>
             <w:r>
-              <w:t>Tổng khách hàng</w:t>
+              <w:t>Tổng sản phẩm</w:t>
             </w:r>
           </w:p>
         </w:tc>
@@ -17497,7 +17469,7 @@
               </w:rPr>
             </w:pPr>
             <w:r>
-              <w:t>Số người dùng</w:t>
+              <w:t>Số sản phẩm trong hệ thống</w:t>
             </w:r>
           </w:p>
         </w:tc>
@@ -17513,7 +17485,9 @@
             <w:insideV w:val="single" w:color="auto" w:sz="4" w:space="0"/>
           </w:tblBorders>
           <w:tblCellMar>
+            <w:top w:w="0" w:type="dxa"/>
             <w:left w:w="108" w:type="dxa"/>
+            <w:bottom w:w="0" w:type="dxa"/>
             <w:right w:w="108" w:type="dxa"/>
           </w:tblCellMar>
         </w:tblPrEx>
@@ -17532,7 +17506,7 @@
               </w:rPr>
             </w:pPr>
             <w:r>
-              <w:t>Đơn hàng mới</w:t>
+              <w:t>Tổng khách hàng</w:t>
             </w:r>
           </w:p>
         </w:tc>
@@ -17551,7 +17525,7 @@
               </w:rPr>
             </w:pPr>
             <w:r>
-              <w:t>Các đơn vừa được tạo</w:t>
+              <w:t>Số người dùng</w:t>
             </w:r>
           </w:p>
         </w:tc>
@@ -17567,7 +17541,9 @@
             <w:insideV w:val="single" w:color="auto" w:sz="4" w:space="0"/>
           </w:tblBorders>
           <w:tblCellMar>
+            <w:top w:w="0" w:type="dxa"/>
             <w:left w:w="108" w:type="dxa"/>
+            <w:bottom w:w="0" w:type="dxa"/>
             <w:right w:w="108" w:type="dxa"/>
           </w:tblCellMar>
         </w:tblPrEx>
@@ -17579,9 +17555,14 @@
           <w:p>
             <w:pPr>
               <w:bidi w:val="0"/>
-            </w:pPr>
-            <w:r>
-              <w:t>Biểu đồ doanh thu</w:t>
+              <w:rPr>
+                <w:rFonts w:hint="default"/>
+                <w:vertAlign w:val="baseline"/>
+                <w:lang w:val="vi-VN"/>
+              </w:rPr>
+            </w:pPr>
+            <w:r>
+              <w:t>Đơn hàng mới</w:t>
             </w:r>
           </w:p>
         </w:tc>
@@ -17593,9 +17574,14 @@
           <w:p>
             <w:pPr>
               <w:bidi w:val="0"/>
-            </w:pPr>
-            <w:r>
-              <w:t>Theo ngày, tháng, năm</w:t>
+              <w:rPr>
+                <w:rFonts w:hint="default"/>
+                <w:vertAlign w:val="baseline"/>
+                <w:lang w:val="vi-VN"/>
+              </w:rPr>
+            </w:pPr>
+            <w:r>
+              <w:t>Các đơn vừa được tạo</w:t>
             </w:r>
           </w:p>
         </w:tc>
@@ -17611,7 +17597,9 @@
             <w:insideV w:val="single" w:color="auto" w:sz="4" w:space="0"/>
           </w:tblBorders>
           <w:tblCellMar>
+            <w:top w:w="0" w:type="dxa"/>
             <w:left w:w="108" w:type="dxa"/>
+            <w:bottom w:w="0" w:type="dxa"/>
             <w:right w:w="108" w:type="dxa"/>
           </w:tblCellMar>
         </w:tblPrEx>
@@ -17625,7 +17613,7 @@
               <w:bidi w:val="0"/>
             </w:pPr>
             <w:r>
-              <w:t>Sản phẩm bán chạy</w:t>
+              <w:t>Biểu đồ doanh thu</w:t>
             </w:r>
           </w:p>
         </w:tc>
@@ -17639,7 +17627,7 @@
               <w:bidi w:val="0"/>
             </w:pPr>
             <w:r>
-              <w:t>Top sản phẩm bán nhiều</w:t>
+              <w:t>Theo ngày, tháng, năm</w:t>
             </w:r>
           </w:p>
         </w:tc>
@@ -17655,7 +17643,55 @@
             <w:insideV w:val="single" w:color="auto" w:sz="4" w:space="0"/>
           </w:tblBorders>
           <w:tblCellMar>
+            <w:top w:w="0" w:type="dxa"/>
             <w:left w:w="108" w:type="dxa"/>
+            <w:bottom w:w="0" w:type="dxa"/>
+            <w:right w:w="108" w:type="dxa"/>
+          </w:tblCellMar>
+        </w:tblPrEx>
+        <w:tc>
+          <w:tcPr>
+            <w:tcW w:w="4952" w:type="dxa"/>
+            <w:vAlign w:val="center"/>
+          </w:tcPr>
+          <w:p>
+            <w:pPr>
+              <w:bidi w:val="0"/>
+            </w:pPr>
+            <w:r>
+              <w:t>Sản phẩm bán chạy</w:t>
+            </w:r>
+          </w:p>
+        </w:tc>
+        <w:tc>
+          <w:tcPr>
+            <w:tcW w:w="4953" w:type="dxa"/>
+            <w:vAlign w:val="center"/>
+          </w:tcPr>
+          <w:p>
+            <w:pPr>
+              <w:bidi w:val="0"/>
+            </w:pPr>
+            <w:r>
+              <w:t>Top sản phẩm bán nhiều</w:t>
+            </w:r>
+          </w:p>
+        </w:tc>
+      </w:tr>
+      <w:tr>
+        <w:tblPrEx>
+          <w:tblBorders>
+            <w:top w:val="single" w:color="auto" w:sz="4" w:space="0"/>
+            <w:left w:val="single" w:color="auto" w:sz="4" w:space="0"/>
+            <w:bottom w:val="single" w:color="auto" w:sz="4" w:space="0"/>
+            <w:right w:val="single" w:color="auto" w:sz="4" w:space="0"/>
+            <w:insideH w:val="single" w:color="auto" w:sz="4" w:space="0"/>
+            <w:insideV w:val="single" w:color="auto" w:sz="4" w:space="0"/>
+          </w:tblBorders>
+          <w:tblCellMar>
+            <w:top w:w="0" w:type="dxa"/>
+            <w:left w:w="108" w:type="dxa"/>
+            <w:bottom w:w="0" w:type="dxa"/>
             <w:right w:w="108" w:type="dxa"/>
           </w:tblCellMar>
         </w:tblPrEx>
@@ -18834,7 +18870,9 @@
         </w:tblBorders>
         <w:tblLayout w:type="autofit"/>
         <w:tblCellMar>
+          <w:top w:w="0" w:type="dxa"/>
           <w:left w:w="108" w:type="dxa"/>
+          <w:bottom w:w="0" w:type="dxa"/>
           <w:right w:w="108" w:type="dxa"/>
         </w:tblCellMar>
       </w:tblPr>
@@ -18852,6 +18890,12 @@
             <w:insideH w:val="single" w:color="auto" w:sz="4" w:space="0"/>
             <w:insideV w:val="single" w:color="auto" w:sz="4" w:space="0"/>
           </w:tblBorders>
+          <w:tblCellMar>
+            <w:top w:w="0" w:type="dxa"/>
+            <w:left w:w="108" w:type="dxa"/>
+            <w:bottom w:w="0" w:type="dxa"/>
+            <w:right w:w="108" w:type="dxa"/>
+          </w:tblCellMar>
         </w:tblPrEx>
         <w:tc>
           <w:tcPr>
@@ -18911,7 +18955,9 @@
             <w:insideV w:val="single" w:color="auto" w:sz="4" w:space="0"/>
           </w:tblBorders>
           <w:tblCellMar>
+            <w:top w:w="0" w:type="dxa"/>
             <w:left w:w="108" w:type="dxa"/>
+            <w:bottom w:w="0" w:type="dxa"/>
             <w:right w:w="108" w:type="dxa"/>
           </w:tblCellMar>
         </w:tblPrEx>
@@ -18948,54 +18994,6 @@
             </w:pPr>
             <w:r>
               <w:t>Tên sản phẩm không được rỗng</w:t>
-            </w:r>
-          </w:p>
-        </w:tc>
-      </w:tr>
-      <w:tr>
-        <w:tblPrEx>
-          <w:tblBorders>
-            <w:top w:val="single" w:color="auto" w:sz="4" w:space="0"/>
-            <w:left w:val="single" w:color="auto" w:sz="4" w:space="0"/>
-            <w:bottom w:val="single" w:color="auto" w:sz="4" w:space="0"/>
-            <w:right w:val="single" w:color="auto" w:sz="4" w:space="0"/>
-            <w:insideH w:val="single" w:color="auto" w:sz="4" w:space="0"/>
-            <w:insideV w:val="single" w:color="auto" w:sz="4" w:space="0"/>
-          </w:tblBorders>
-        </w:tblPrEx>
-        <w:tc>
-          <w:tcPr>
-            <w:tcW w:w="4952" w:type="dxa"/>
-          </w:tcPr>
-          <w:p>
-            <w:pPr>
-              <w:bidi w:val="0"/>
-              <w:rPr>
-                <w:rFonts w:hint="default"/>
-                <w:vertAlign w:val="baseline"/>
-                <w:lang w:val="vi-VN"/>
-              </w:rPr>
-            </w:pPr>
-            <w:r>
-              <w:t>Slug</w:t>
-            </w:r>
-          </w:p>
-        </w:tc>
-        <w:tc>
-          <w:tcPr>
-            <w:tcW w:w="4953" w:type="dxa"/>
-          </w:tcPr>
-          <w:p>
-            <w:pPr>
-              <w:bidi w:val="0"/>
-              <w:rPr>
-                <w:rFonts w:hint="default"/>
-                <w:vertAlign w:val="baseline"/>
-                <w:lang w:val="vi-VN"/>
-              </w:rPr>
-            </w:pPr>
-            <w:r>
-              <w:t>Giá phải là số</w:t>
             </w:r>
           </w:p>
         </w:tc>
@@ -19011,7 +19009,9 @@
             <w:insideV w:val="single" w:color="auto" w:sz="4" w:space="0"/>
           </w:tblBorders>
           <w:tblCellMar>
+            <w:top w:w="0" w:type="dxa"/>
             <w:left w:w="108" w:type="dxa"/>
+            <w:bottom w:w="0" w:type="dxa"/>
             <w:right w:w="108" w:type="dxa"/>
           </w:tblCellMar>
         </w:tblPrEx>
@@ -19029,7 +19029,7 @@
               </w:rPr>
             </w:pPr>
             <w:r>
-              <w:t>Danh mục</w:t>
+              <w:t>Slug</w:t>
             </w:r>
           </w:p>
         </w:tc>
@@ -19047,55 +19047,7 @@
               </w:rPr>
             </w:pPr>
             <w:r>
-              <w:t>Số lượng phải là số nguyên</w:t>
-            </w:r>
-          </w:p>
-        </w:tc>
-      </w:tr>
-      <w:tr>
-        <w:tblPrEx>
-          <w:tblBorders>
-            <w:top w:val="single" w:color="auto" w:sz="4" w:space="0"/>
-            <w:left w:val="single" w:color="auto" w:sz="4" w:space="0"/>
-            <w:bottom w:val="single" w:color="auto" w:sz="4" w:space="0"/>
-            <w:right w:val="single" w:color="auto" w:sz="4" w:space="0"/>
-            <w:insideH w:val="single" w:color="auto" w:sz="4" w:space="0"/>
-            <w:insideV w:val="single" w:color="auto" w:sz="4" w:space="0"/>
-          </w:tblBorders>
-        </w:tblPrEx>
-        <w:tc>
-          <w:tcPr>
-            <w:tcW w:w="4952" w:type="dxa"/>
-          </w:tcPr>
-          <w:p>
-            <w:pPr>
-              <w:bidi w:val="0"/>
-              <w:rPr>
-                <w:rFonts w:hint="default"/>
-                <w:vertAlign w:val="baseline"/>
-                <w:lang w:val="vi-VN"/>
-              </w:rPr>
-            </w:pPr>
-            <w:r>
-              <w:t>Giá nhập</w:t>
-            </w:r>
-          </w:p>
-        </w:tc>
-        <w:tc>
-          <w:tcPr>
-            <w:tcW w:w="4953" w:type="dxa"/>
-          </w:tcPr>
-          <w:p>
-            <w:pPr>
-              <w:bidi w:val="0"/>
-              <w:rPr>
-                <w:rFonts w:hint="default"/>
-                <w:vertAlign w:val="baseline"/>
-                <w:lang w:val="vi-VN"/>
-              </w:rPr>
-            </w:pPr>
-            <w:r>
-              <w:t>Danh mục bắt buộc chọn</w:t>
+              <w:t>Giá phải là số</w:t>
             </w:r>
           </w:p>
         </w:tc>
@@ -19111,7 +19063,9 @@
             <w:insideV w:val="single" w:color="auto" w:sz="4" w:space="0"/>
           </w:tblBorders>
           <w:tblCellMar>
+            <w:top w:w="0" w:type="dxa"/>
             <w:left w:w="108" w:type="dxa"/>
+            <w:bottom w:w="0" w:type="dxa"/>
             <w:right w:w="108" w:type="dxa"/>
           </w:tblCellMar>
         </w:tblPrEx>
@@ -19129,7 +19083,7 @@
               </w:rPr>
             </w:pPr>
             <w:r>
-              <w:t>Giá bán</w:t>
+              <w:t>Danh mục</w:t>
             </w:r>
           </w:p>
         </w:tc>
@@ -19147,7 +19101,7 @@
               </w:rPr>
             </w:pPr>
             <w:r>
-              <w:t>Ảnh đúng định dạng</w:t>
+              <w:t>Số lượng phải là số nguyên</w:t>
             </w:r>
           </w:p>
         </w:tc>
@@ -19163,7 +19117,9 @@
             <w:insideV w:val="single" w:color="auto" w:sz="4" w:space="0"/>
           </w:tblBorders>
           <w:tblCellMar>
+            <w:top w:w="0" w:type="dxa"/>
             <w:left w:w="108" w:type="dxa"/>
+            <w:bottom w:w="0" w:type="dxa"/>
             <w:right w:w="108" w:type="dxa"/>
           </w:tblCellMar>
         </w:tblPrEx>
@@ -19181,7 +19137,7 @@
               </w:rPr>
             </w:pPr>
             <w:r>
-              <w:t>Giá giảm</w:t>
+              <w:t>Giá nhập</w:t>
             </w:r>
           </w:p>
         </w:tc>
@@ -19198,46 +19154,9 @@
                 <w:lang w:val="vi-VN"/>
               </w:rPr>
             </w:pPr>
-          </w:p>
-        </w:tc>
-      </w:tr>
-      <w:tr>
-        <w:tblPrEx>
-          <w:tblBorders>
-            <w:top w:val="single" w:color="auto" w:sz="4" w:space="0"/>
-            <w:left w:val="single" w:color="auto" w:sz="4" w:space="0"/>
-            <w:bottom w:val="single" w:color="auto" w:sz="4" w:space="0"/>
-            <w:right w:val="single" w:color="auto" w:sz="4" w:space="0"/>
-            <w:insideH w:val="single" w:color="auto" w:sz="4" w:space="0"/>
-            <w:insideV w:val="single" w:color="auto" w:sz="4" w:space="0"/>
-          </w:tblBorders>
-        </w:tblPrEx>
-        <w:tc>
-          <w:tcPr>
-            <w:tcW w:w="4952" w:type="dxa"/>
-          </w:tcPr>
-          <w:p>
-            <w:pPr>
-              <w:bidi w:val="0"/>
-            </w:pPr>
-            <w:r>
-              <w:t>Số lượng</w:t>
-            </w:r>
-          </w:p>
-        </w:tc>
-        <w:tc>
-          <w:tcPr>
-            <w:tcW w:w="4953" w:type="dxa"/>
-          </w:tcPr>
-          <w:p>
-            <w:pPr>
-              <w:bidi w:val="0"/>
-              <w:rPr>
-                <w:rFonts w:hint="default"/>
-                <w:vertAlign w:val="baseline"/>
-                <w:lang w:val="vi-VN"/>
-              </w:rPr>
-            </w:pPr>
+            <w:r>
+              <w:t>Danh mục bắt buộc chọn</w:t>
+            </w:r>
           </w:p>
         </w:tc>
       </w:tr>
@@ -19252,7 +19171,9 @@
             <w:insideV w:val="single" w:color="auto" w:sz="4" w:space="0"/>
           </w:tblBorders>
           <w:tblCellMar>
+            <w:top w:w="0" w:type="dxa"/>
             <w:left w:w="108" w:type="dxa"/>
+            <w:bottom w:w="0" w:type="dxa"/>
             <w:right w:w="108" w:type="dxa"/>
           </w:tblCellMar>
         </w:tblPrEx>
@@ -19263,9 +19184,14 @@
           <w:p>
             <w:pPr>
               <w:bidi w:val="0"/>
-            </w:pPr>
-            <w:r>
-              <w:t>Mô tả</w:t>
+              <w:rPr>
+                <w:rFonts w:hint="default"/>
+                <w:vertAlign w:val="baseline"/>
+                <w:lang w:val="vi-VN"/>
+              </w:rPr>
+            </w:pPr>
+            <w:r>
+              <w:t>Giá bán</w:t>
             </w:r>
           </w:p>
         </w:tc>
@@ -19282,6 +19208,9 @@
                 <w:lang w:val="vi-VN"/>
               </w:rPr>
             </w:pPr>
+            <w:r>
+              <w:t>Ảnh đúng định dạng</w:t>
+            </w:r>
           </w:p>
         </w:tc>
       </w:tr>
@@ -19296,7 +19225,9 @@
             <w:insideV w:val="single" w:color="auto" w:sz="4" w:space="0"/>
           </w:tblBorders>
           <w:tblCellMar>
+            <w:top w:w="0" w:type="dxa"/>
             <w:left w:w="108" w:type="dxa"/>
+            <w:bottom w:w="0" w:type="dxa"/>
             <w:right w:w="108" w:type="dxa"/>
           </w:tblCellMar>
         </w:tblPrEx>
@@ -19307,9 +19238,14 @@
           <w:p>
             <w:pPr>
               <w:bidi w:val="0"/>
-            </w:pPr>
-            <w:r>
-              <w:t>Ảnh đại diện</w:t>
+              <w:rPr>
+                <w:rFonts w:hint="default"/>
+                <w:vertAlign w:val="baseline"/>
+                <w:lang w:val="vi-VN"/>
+              </w:rPr>
+            </w:pPr>
+            <w:r>
+              <w:t>Giá giảm</w:t>
             </w:r>
           </w:p>
         </w:tc>
@@ -19319,6 +19255,7 @@
           </w:tcPr>
           <w:p>
             <w:pPr>
+              <w:bidi w:val="0"/>
               <w:rPr>
                 <w:rFonts w:hint="default"/>
                 <w:vertAlign w:val="baseline"/>
@@ -19339,7 +19276,9 @@
             <w:insideV w:val="single" w:color="auto" w:sz="4" w:space="0"/>
           </w:tblBorders>
           <w:tblCellMar>
+            <w:top w:w="0" w:type="dxa"/>
             <w:left w:w="108" w:type="dxa"/>
+            <w:bottom w:w="0" w:type="dxa"/>
             <w:right w:w="108" w:type="dxa"/>
           </w:tblCellMar>
         </w:tblPrEx>
@@ -19352,7 +19291,7 @@
               <w:bidi w:val="0"/>
             </w:pPr>
             <w:r>
-              <w:t>Nhiều ảnh phụ</w:t>
+              <w:t>Số lượng</w:t>
             </w:r>
           </w:p>
         </w:tc>
@@ -19362,6 +19301,7 @@
           </w:tcPr>
           <w:p>
             <w:pPr>
+              <w:bidi w:val="0"/>
               <w:rPr>
                 <w:rFonts w:hint="default"/>
                 <w:vertAlign w:val="baseline"/>
@@ -19381,6 +19321,148 @@
             <w:insideH w:val="single" w:color="auto" w:sz="4" w:space="0"/>
             <w:insideV w:val="single" w:color="auto" w:sz="4" w:space="0"/>
           </w:tblBorders>
+          <w:tblCellMar>
+            <w:top w:w="0" w:type="dxa"/>
+            <w:left w:w="108" w:type="dxa"/>
+            <w:bottom w:w="0" w:type="dxa"/>
+            <w:right w:w="108" w:type="dxa"/>
+          </w:tblCellMar>
+        </w:tblPrEx>
+        <w:tc>
+          <w:tcPr>
+            <w:tcW w:w="4952" w:type="dxa"/>
+          </w:tcPr>
+          <w:p>
+            <w:pPr>
+              <w:bidi w:val="0"/>
+            </w:pPr>
+            <w:r>
+              <w:t>Mô tả</w:t>
+            </w:r>
+          </w:p>
+        </w:tc>
+        <w:tc>
+          <w:tcPr>
+            <w:tcW w:w="4953" w:type="dxa"/>
+          </w:tcPr>
+          <w:p>
+            <w:pPr>
+              <w:bidi w:val="0"/>
+              <w:rPr>
+                <w:rFonts w:hint="default"/>
+                <w:vertAlign w:val="baseline"/>
+                <w:lang w:val="vi-VN"/>
+              </w:rPr>
+            </w:pPr>
+          </w:p>
+        </w:tc>
+      </w:tr>
+      <w:tr>
+        <w:tblPrEx>
+          <w:tblBorders>
+            <w:top w:val="single" w:color="auto" w:sz="4" w:space="0"/>
+            <w:left w:val="single" w:color="auto" w:sz="4" w:space="0"/>
+            <w:bottom w:val="single" w:color="auto" w:sz="4" w:space="0"/>
+            <w:right w:val="single" w:color="auto" w:sz="4" w:space="0"/>
+            <w:insideH w:val="single" w:color="auto" w:sz="4" w:space="0"/>
+            <w:insideV w:val="single" w:color="auto" w:sz="4" w:space="0"/>
+          </w:tblBorders>
+          <w:tblCellMar>
+            <w:top w:w="0" w:type="dxa"/>
+            <w:left w:w="108" w:type="dxa"/>
+            <w:bottom w:w="0" w:type="dxa"/>
+            <w:right w:w="108" w:type="dxa"/>
+          </w:tblCellMar>
+        </w:tblPrEx>
+        <w:tc>
+          <w:tcPr>
+            <w:tcW w:w="4952" w:type="dxa"/>
+          </w:tcPr>
+          <w:p>
+            <w:pPr>
+              <w:bidi w:val="0"/>
+            </w:pPr>
+            <w:r>
+              <w:t>Ảnh đại diện</w:t>
+            </w:r>
+          </w:p>
+        </w:tc>
+        <w:tc>
+          <w:tcPr>
+            <w:tcW w:w="4953" w:type="dxa"/>
+          </w:tcPr>
+          <w:p>
+            <w:pPr>
+              <w:rPr>
+                <w:rFonts w:hint="default"/>
+                <w:vertAlign w:val="baseline"/>
+                <w:lang w:val="vi-VN"/>
+              </w:rPr>
+            </w:pPr>
+          </w:p>
+        </w:tc>
+      </w:tr>
+      <w:tr>
+        <w:tblPrEx>
+          <w:tblBorders>
+            <w:top w:val="single" w:color="auto" w:sz="4" w:space="0"/>
+            <w:left w:val="single" w:color="auto" w:sz="4" w:space="0"/>
+            <w:bottom w:val="single" w:color="auto" w:sz="4" w:space="0"/>
+            <w:right w:val="single" w:color="auto" w:sz="4" w:space="0"/>
+            <w:insideH w:val="single" w:color="auto" w:sz="4" w:space="0"/>
+            <w:insideV w:val="single" w:color="auto" w:sz="4" w:space="0"/>
+          </w:tblBorders>
+          <w:tblCellMar>
+            <w:top w:w="0" w:type="dxa"/>
+            <w:left w:w="108" w:type="dxa"/>
+            <w:bottom w:w="0" w:type="dxa"/>
+            <w:right w:w="108" w:type="dxa"/>
+          </w:tblCellMar>
+        </w:tblPrEx>
+        <w:tc>
+          <w:tcPr>
+            <w:tcW w:w="4952" w:type="dxa"/>
+          </w:tcPr>
+          <w:p>
+            <w:pPr>
+              <w:bidi w:val="0"/>
+            </w:pPr>
+            <w:r>
+              <w:t>Nhiều ảnh phụ</w:t>
+            </w:r>
+          </w:p>
+        </w:tc>
+        <w:tc>
+          <w:tcPr>
+            <w:tcW w:w="4953" w:type="dxa"/>
+          </w:tcPr>
+          <w:p>
+            <w:pPr>
+              <w:rPr>
+                <w:rFonts w:hint="default"/>
+                <w:vertAlign w:val="baseline"/>
+                <w:lang w:val="vi-VN"/>
+              </w:rPr>
+            </w:pPr>
+          </w:p>
+        </w:tc>
+      </w:tr>
+      <w:tr>
+        <w:tblPrEx>
+          <w:tblBorders>
+            <w:top w:val="single" w:color="auto" w:sz="4" w:space="0"/>
+            <w:left w:val="single" w:color="auto" w:sz="4" w:space="0"/>
+            <w:bottom w:val="single" w:color="auto" w:sz="4" w:space="0"/>
+            <w:right w:val="single" w:color="auto" w:sz="4" w:space="0"/>
+            <w:insideH w:val="single" w:color="auto" w:sz="4" w:space="0"/>
+            <w:insideV w:val="single" w:color="auto" w:sz="4" w:space="0"/>
+          </w:tblBorders>
+          <w:tblCellMar>
+            <w:top w:w="0" w:type="dxa"/>
+            <w:left w:w="108" w:type="dxa"/>
+            <w:bottom w:w="0" w:type="dxa"/>
+            <w:right w:w="108" w:type="dxa"/>
+          </w:tblCellMar>
         </w:tblPrEx>
         <w:tc>
           <w:tcPr>
@@ -22157,7 +22239,9 @@
         </w:tblBorders>
         <w:tblLayout w:type="autofit"/>
         <w:tblCellMar>
+          <w:top w:w="0" w:type="dxa"/>
           <w:left w:w="108" w:type="dxa"/>
+          <w:bottom w:w="0" w:type="dxa"/>
           <w:right w:w="108" w:type="dxa"/>
         </w:tblCellMar>
       </w:tblPr>
@@ -22176,6 +22260,12 @@
             <w:insideH w:val="single" w:color="auto" w:sz="4" w:space="0"/>
             <w:insideV w:val="single" w:color="auto" w:sz="4" w:space="0"/>
           </w:tblBorders>
+          <w:tblCellMar>
+            <w:top w:w="0" w:type="dxa"/>
+            <w:left w:w="108" w:type="dxa"/>
+            <w:bottom w:w="0" w:type="dxa"/>
+            <w:right w:w="108" w:type="dxa"/>
+          </w:tblCellMar>
         </w:tblPrEx>
         <w:tc>
           <w:tcPr>
@@ -22273,7 +22363,9 @@
             <w:insideV w:val="single" w:color="auto" w:sz="4" w:space="0"/>
           </w:tblBorders>
           <w:tblCellMar>
+            <w:top w:w="0" w:type="dxa"/>
             <w:left w:w="108" w:type="dxa"/>
+            <w:bottom w:w="0" w:type="dxa"/>
             <w:right w:w="108" w:type="dxa"/>
           </w:tblCellMar>
         </w:tblPrEx>
@@ -22346,87 +22438,6 @@
                 <w:vertAlign w:val="baseline"/>
               </w:rPr>
               <w:t>Quản trị viên toàn hệ thống</w:t>
-            </w:r>
-          </w:p>
-        </w:tc>
-      </w:tr>
-      <w:tr>
-        <w:tblPrEx>
-          <w:tblBorders>
-            <w:top w:val="single" w:color="auto" w:sz="4" w:space="0"/>
-            <w:left w:val="single" w:color="auto" w:sz="4" w:space="0"/>
-            <w:bottom w:val="single" w:color="auto" w:sz="4" w:space="0"/>
-            <w:right w:val="single" w:color="auto" w:sz="4" w:space="0"/>
-            <w:insideH w:val="single" w:color="auto" w:sz="4" w:space="0"/>
-            <w:insideV w:val="single" w:color="auto" w:sz="4" w:space="0"/>
-          </w:tblBorders>
-        </w:tblPrEx>
-        <w:tc>
-          <w:tcPr>
-            <w:tcW w:w="1684" w:type="dxa"/>
-          </w:tcPr>
-          <w:p>
-            <w:pPr>
-              <w:bidi w:val="0"/>
-              <w:jc w:val="center"/>
-              <w:rPr>
-                <w:rFonts w:hint="default"/>
-                <w:b/>
-                <w:bCs/>
-                <w:vertAlign w:val="baseline"/>
-                <w:lang w:val="vi-VN"/>
-              </w:rPr>
-            </w:pPr>
-            <w:r>
-              <w:rPr>
-                <w:rFonts w:hint="default"/>
-                <w:b/>
-                <w:bCs/>
-                <w:vertAlign w:val="baseline"/>
-                <w:lang w:val="vi-VN"/>
-              </w:rPr>
-              <w:t>2</w:t>
-            </w:r>
-          </w:p>
-        </w:tc>
-        <w:tc>
-          <w:tcPr>
-            <w:tcW w:w="2171" w:type="dxa"/>
-          </w:tcPr>
-          <w:p>
-            <w:pPr>
-              <w:bidi w:val="0"/>
-              <w:jc w:val="center"/>
-              <w:rPr>
-                <w:vertAlign w:val="baseline"/>
-              </w:rPr>
-            </w:pPr>
-            <w:r>
-              <w:rPr>
-                <w:rFonts w:hint="default"/>
-                <w:vertAlign w:val="baseline"/>
-              </w:rPr>
-              <w:t>Staff</w:t>
-            </w:r>
-          </w:p>
-        </w:tc>
-        <w:tc>
-          <w:tcPr>
-            <w:tcW w:w="6048" w:type="dxa"/>
-          </w:tcPr>
-          <w:p>
-            <w:pPr>
-              <w:bidi w:val="0"/>
-              <w:rPr>
-                <w:vertAlign w:val="baseline"/>
-              </w:rPr>
-            </w:pPr>
-            <w:r>
-              <w:rPr>
-                <w:rFonts w:hint="default"/>
-                <w:vertAlign w:val="baseline"/>
-              </w:rPr>
-              <w:t>Nhân viên xử lý đơn hàng và hỗ trợ khách hàng</w:t>
             </w:r>
           </w:p>
         </w:tc>
@@ -22442,7 +22453,9 @@
             <w:insideV w:val="single" w:color="auto" w:sz="4" w:space="0"/>
           </w:tblBorders>
           <w:tblCellMar>
+            <w:top w:w="0" w:type="dxa"/>
             <w:left w:w="108" w:type="dxa"/>
+            <w:bottom w:w="0" w:type="dxa"/>
             <w:right w:w="108" w:type="dxa"/>
           </w:tblCellMar>
         </w:tblPrEx>
@@ -22470,7 +22483,7 @@
                 <w:vertAlign w:val="baseline"/>
                 <w:lang w:val="vi-VN"/>
               </w:rPr>
-              <w:t>3</w:t>
+              <w:t>2</w:t>
             </w:r>
           </w:p>
         </w:tc>
@@ -22491,7 +22504,7 @@
                 <w:rFonts w:hint="default"/>
                 <w:vertAlign w:val="baseline"/>
               </w:rPr>
-              <w:t>Customer</w:t>
+              <w:t>Staff</w:t>
             </w:r>
           </w:p>
         </w:tc>
@@ -22511,7 +22524,7 @@
                 <w:rFonts w:hint="default"/>
                 <w:vertAlign w:val="baseline"/>
               </w:rPr>
-              <w:t>Khách hàng mua sắm trên hệ thống</w:t>
+              <w:t>Nhân viên xử lý đơn hàng và hỗ trợ khách hàng</w:t>
             </w:r>
           </w:p>
         </w:tc>
@@ -22527,7 +22540,96 @@
             <w:insideV w:val="single" w:color="auto" w:sz="4" w:space="0"/>
           </w:tblBorders>
           <w:tblCellMar>
+            <w:top w:w="0" w:type="dxa"/>
             <w:left w:w="108" w:type="dxa"/>
+            <w:bottom w:w="0" w:type="dxa"/>
+            <w:right w:w="108" w:type="dxa"/>
+          </w:tblCellMar>
+        </w:tblPrEx>
+        <w:tc>
+          <w:tcPr>
+            <w:tcW w:w="1684" w:type="dxa"/>
+          </w:tcPr>
+          <w:p>
+            <w:pPr>
+              <w:bidi w:val="0"/>
+              <w:jc w:val="center"/>
+              <w:rPr>
+                <w:rFonts w:hint="default"/>
+                <w:b/>
+                <w:bCs/>
+                <w:vertAlign w:val="baseline"/>
+                <w:lang w:val="vi-VN"/>
+              </w:rPr>
+            </w:pPr>
+            <w:r>
+              <w:rPr>
+                <w:rFonts w:hint="default"/>
+                <w:b/>
+                <w:bCs/>
+                <w:vertAlign w:val="baseline"/>
+                <w:lang w:val="vi-VN"/>
+              </w:rPr>
+              <w:t>3</w:t>
+            </w:r>
+          </w:p>
+        </w:tc>
+        <w:tc>
+          <w:tcPr>
+            <w:tcW w:w="2171" w:type="dxa"/>
+          </w:tcPr>
+          <w:p>
+            <w:pPr>
+              <w:bidi w:val="0"/>
+              <w:jc w:val="center"/>
+              <w:rPr>
+                <w:vertAlign w:val="baseline"/>
+              </w:rPr>
+            </w:pPr>
+            <w:r>
+              <w:rPr>
+                <w:rFonts w:hint="default"/>
+                <w:vertAlign w:val="baseline"/>
+              </w:rPr>
+              <w:t>Customer</w:t>
+            </w:r>
+          </w:p>
+        </w:tc>
+        <w:tc>
+          <w:tcPr>
+            <w:tcW w:w="6048" w:type="dxa"/>
+          </w:tcPr>
+          <w:p>
+            <w:pPr>
+              <w:bidi w:val="0"/>
+              <w:rPr>
+                <w:vertAlign w:val="baseline"/>
+              </w:rPr>
+            </w:pPr>
+            <w:r>
+              <w:rPr>
+                <w:rFonts w:hint="default"/>
+                <w:vertAlign w:val="baseline"/>
+              </w:rPr>
+              <w:t>Khách hàng mua sắm trên hệ thống</w:t>
+            </w:r>
+          </w:p>
+        </w:tc>
+      </w:tr>
+      <w:tr>
+        <w:tblPrEx>
+          <w:tblBorders>
+            <w:top w:val="single" w:color="auto" w:sz="4" w:space="0"/>
+            <w:left w:val="single" w:color="auto" w:sz="4" w:space="0"/>
+            <w:bottom w:val="single" w:color="auto" w:sz="4" w:space="0"/>
+            <w:right w:val="single" w:color="auto" w:sz="4" w:space="0"/>
+            <w:insideH w:val="single" w:color="auto" w:sz="4" w:space="0"/>
+            <w:insideV w:val="single" w:color="auto" w:sz="4" w:space="0"/>
+          </w:tblBorders>
+          <w:tblCellMar>
+            <w:top w:w="0" w:type="dxa"/>
+            <w:left w:w="108" w:type="dxa"/>
+            <w:bottom w:w="0" w:type="dxa"/>
             <w:right w:w="108" w:type="dxa"/>
           </w:tblCellMar>
         </w:tblPrEx>
@@ -22658,7 +22760,9 @@
         </w:tblBorders>
         <w:tblLayout w:type="autofit"/>
         <w:tblCellMar>
+          <w:top w:w="0" w:type="dxa"/>
           <w:left w:w="108" w:type="dxa"/>
+          <w:bottom w:w="0" w:type="dxa"/>
           <w:right w:w="108" w:type="dxa"/>
         </w:tblCellMar>
       </w:tblPr>
@@ -22677,7 +22781,9 @@
             <w:insideV w:val="single" w:color="auto" w:sz="4" w:space="0"/>
           </w:tblBorders>
           <w:tblCellMar>
+            <w:top w:w="0" w:type="dxa"/>
             <w:left w:w="108" w:type="dxa"/>
+            <w:bottom w:w="0" w:type="dxa"/>
             <w:right w:w="108" w:type="dxa"/>
           </w:tblCellMar>
         </w:tblPrEx>
@@ -22746,7 +22852,9 @@
             <w:insideV w:val="single" w:color="auto" w:sz="4" w:space="0"/>
           </w:tblBorders>
           <w:tblCellMar>
+            <w:top w:w="0" w:type="dxa"/>
             <w:left w:w="108" w:type="dxa"/>
+            <w:bottom w:w="0" w:type="dxa"/>
             <w:right w:w="108" w:type="dxa"/>
           </w:tblCellMar>
         </w:tblPrEx>
@@ -22803,7 +22911,9 @@
             <w:insideV w:val="single" w:color="auto" w:sz="4" w:space="0"/>
           </w:tblBorders>
           <w:tblCellMar>
+            <w:top w:w="0" w:type="dxa"/>
             <w:left w:w="108" w:type="dxa"/>
+            <w:bottom w:w="0" w:type="dxa"/>
             <w:right w:w="108" w:type="dxa"/>
           </w:tblCellMar>
         </w:tblPrEx>
@@ -22860,7 +22970,9 @@
             <w:insideV w:val="single" w:color="auto" w:sz="4" w:space="0"/>
           </w:tblBorders>
           <w:tblCellMar>
+            <w:top w:w="0" w:type="dxa"/>
             <w:left w:w="108" w:type="dxa"/>
+            <w:bottom w:w="0" w:type="dxa"/>
             <w:right w:w="108" w:type="dxa"/>
           </w:tblCellMar>
         </w:tblPrEx>
@@ -22917,7 +23029,9 @@
             <w:insideV w:val="single" w:color="auto" w:sz="4" w:space="0"/>
           </w:tblBorders>
           <w:tblCellMar>
+            <w:top w:w="0" w:type="dxa"/>
             <w:left w:w="108" w:type="dxa"/>
+            <w:bottom w:w="0" w:type="dxa"/>
             <w:right w:w="108" w:type="dxa"/>
           </w:tblCellMar>
         </w:tblPrEx>
@@ -25449,7 +25563,9 @@
         </w:tblBorders>
         <w:tblLayout w:type="autofit"/>
         <w:tblCellMar>
+          <w:top w:w="0" w:type="dxa"/>
           <w:left w:w="108" w:type="dxa"/>
+          <w:bottom w:w="0" w:type="dxa"/>
           <w:right w:w="108" w:type="dxa"/>
         </w:tblCellMar>
       </w:tblPr>
@@ -25468,7 +25584,9 @@
             <w:insideV w:val="single" w:color="auto" w:sz="4" w:space="0"/>
           </w:tblBorders>
           <w:tblCellMar>
+            <w:top w:w="0" w:type="dxa"/>
             <w:left w:w="108" w:type="dxa"/>
+            <w:bottom w:w="0" w:type="dxa"/>
             <w:right w:w="108" w:type="dxa"/>
           </w:tblCellMar>
         </w:tblPrEx>
@@ -25532,7 +25650,9 @@
             <w:insideV w:val="single" w:color="auto" w:sz="4" w:space="0"/>
           </w:tblBorders>
           <w:tblCellMar>
+            <w:top w:w="0" w:type="dxa"/>
             <w:left w:w="108" w:type="dxa"/>
+            <w:bottom w:w="0" w:type="dxa"/>
             <w:right w:w="108" w:type="dxa"/>
           </w:tblCellMar>
         </w:tblPrEx>
@@ -25582,7 +25702,9 @@
             <w:insideV w:val="single" w:color="auto" w:sz="4" w:space="0"/>
           </w:tblBorders>
           <w:tblCellMar>
+            <w:top w:w="0" w:type="dxa"/>
             <w:left w:w="108" w:type="dxa"/>
+            <w:bottom w:w="0" w:type="dxa"/>
             <w:right w:w="108" w:type="dxa"/>
           </w:tblCellMar>
         </w:tblPrEx>
@@ -25632,7 +25754,9 @@
             <w:insideV w:val="single" w:color="auto" w:sz="4" w:space="0"/>
           </w:tblBorders>
           <w:tblCellMar>
+            <w:top w:w="0" w:type="dxa"/>
             <w:left w:w="108" w:type="dxa"/>
+            <w:bottom w:w="0" w:type="dxa"/>
             <w:right w:w="108" w:type="dxa"/>
           </w:tblCellMar>
         </w:tblPrEx>
@@ -25682,7 +25806,9 @@
             <w:insideV w:val="single" w:color="auto" w:sz="4" w:space="0"/>
           </w:tblBorders>
           <w:tblCellMar>
+            <w:top w:w="0" w:type="dxa"/>
             <w:left w:w="108" w:type="dxa"/>
+            <w:bottom w:w="0" w:type="dxa"/>
             <w:right w:w="108" w:type="dxa"/>
           </w:tblCellMar>
         </w:tblPrEx>
@@ -25717,52 +25843,6 @@
             </w:pPr>
             <w:r>
               <w:t>Tổng số đơn đã tạo</w:t>
-            </w:r>
-          </w:p>
-        </w:tc>
-      </w:tr>
-      <w:tr>
-        <w:tblPrEx>
-          <w:tblBorders>
-            <w:top w:val="single" w:color="auto" w:sz="4" w:space="0"/>
-            <w:left w:val="single" w:color="auto" w:sz="4" w:space="0"/>
-            <w:bottom w:val="single" w:color="auto" w:sz="4" w:space="0"/>
-            <w:right w:val="single" w:color="auto" w:sz="4" w:space="0"/>
-            <w:insideH w:val="single" w:color="auto" w:sz="4" w:space="0"/>
-            <w:insideV w:val="single" w:color="auto" w:sz="4" w:space="0"/>
-          </w:tblBorders>
-        </w:tblPrEx>
-        <w:tc>
-          <w:tcPr>
-            <w:tcW w:w="4952" w:type="dxa"/>
-            <w:vAlign w:val="center"/>
-          </w:tcPr>
-          <w:p>
-            <w:pPr>
-              <w:bidi w:val="0"/>
-              <w:rPr>
-                <w:vertAlign w:val="baseline"/>
-              </w:rPr>
-            </w:pPr>
-            <w:r>
-              <w:t>Đơn thành công</w:t>
-            </w:r>
-          </w:p>
-        </w:tc>
-        <w:tc>
-          <w:tcPr>
-            <w:tcW w:w="4953" w:type="dxa"/>
-            <w:vAlign w:val="center"/>
-          </w:tcPr>
-          <w:p>
-            <w:pPr>
-              <w:bidi w:val="0"/>
-              <w:rPr>
-                <w:vertAlign w:val="baseline"/>
-              </w:rPr>
-            </w:pPr>
-            <w:r>
-              <w:t>Đơn đã hoàn tất</w:t>
             </w:r>
           </w:p>
         </w:tc>
@@ -25778,7 +25858,9 @@
             <w:insideV w:val="single" w:color="auto" w:sz="4" w:space="0"/>
           </w:tblBorders>
           <w:tblCellMar>
+            <w:top w:w="0" w:type="dxa"/>
             <w:left w:w="108" w:type="dxa"/>
+            <w:bottom w:w="0" w:type="dxa"/>
             <w:right w:w="108" w:type="dxa"/>
           </w:tblCellMar>
         </w:tblPrEx>
@@ -25795,7 +25877,7 @@
               </w:rPr>
             </w:pPr>
             <w:r>
-              <w:t>Đơn bị hủy</w:t>
+              <w:t>Đơn thành công</w:t>
             </w:r>
           </w:p>
         </w:tc>
@@ -25812,7 +25894,7 @@
               </w:rPr>
             </w:pPr>
             <w:r>
-              <w:t>Đơn bị hủy</w:t>
+              <w:t>Đơn đã hoàn tất</w:t>
             </w:r>
           </w:p>
         </w:tc>
@@ -25828,7 +25910,9 @@
             <w:insideV w:val="single" w:color="auto" w:sz="4" w:space="0"/>
           </w:tblBorders>
           <w:tblCellMar>
+            <w:top w:w="0" w:type="dxa"/>
             <w:left w:w="108" w:type="dxa"/>
+            <w:bottom w:w="0" w:type="dxa"/>
             <w:right w:w="108" w:type="dxa"/>
           </w:tblCellMar>
         </w:tblPrEx>
@@ -25840,9 +25924,12 @@
           <w:p>
             <w:pPr>
               <w:bidi w:val="0"/>
-            </w:pPr>
-            <w:r>
-              <w:t>Sản phẩm bán chạy</w:t>
+              <w:rPr>
+                <w:vertAlign w:val="baseline"/>
+              </w:rPr>
+            </w:pPr>
+            <w:r>
+              <w:t>Đơn bị hủy</w:t>
             </w:r>
           </w:p>
         </w:tc>
@@ -25854,49 +25941,12 @@
           <w:p>
             <w:pPr>
               <w:bidi w:val="0"/>
-            </w:pPr>
-            <w:r>
-              <w:t>Sản phẩm có số lượng bán cao</w:t>
-            </w:r>
-          </w:p>
-        </w:tc>
-      </w:tr>
-      <w:tr>
-        <w:tblPrEx>
-          <w:tblBorders>
-            <w:top w:val="single" w:color="auto" w:sz="4" w:space="0"/>
-            <w:left w:val="single" w:color="auto" w:sz="4" w:space="0"/>
-            <w:bottom w:val="single" w:color="auto" w:sz="4" w:space="0"/>
-            <w:right w:val="single" w:color="auto" w:sz="4" w:space="0"/>
-            <w:insideH w:val="single" w:color="auto" w:sz="4" w:space="0"/>
-            <w:insideV w:val="single" w:color="auto" w:sz="4" w:space="0"/>
-          </w:tblBorders>
-        </w:tblPrEx>
-        <w:tc>
-          <w:tcPr>
-            <w:tcW w:w="4952" w:type="dxa"/>
-            <w:vAlign w:val="center"/>
-          </w:tcPr>
-          <w:p>
-            <w:pPr>
-              <w:bidi w:val="0"/>
-            </w:pPr>
-            <w:r>
-              <w:t>Khách hàng mới</w:t>
-            </w:r>
-          </w:p>
-        </w:tc>
-        <w:tc>
-          <w:tcPr>
-            <w:tcW w:w="4953" w:type="dxa"/>
-            <w:vAlign w:val="center"/>
-          </w:tcPr>
-          <w:p>
-            <w:pPr>
-              <w:bidi w:val="0"/>
-            </w:pPr>
-            <w:r>
-              <w:t>Người dùng mới đăng ký</w:t>
+              <w:rPr>
+                <w:vertAlign w:val="baseline"/>
+              </w:rPr>
+            </w:pPr>
+            <w:r>
+              <w:t>Đơn bị hủy</w:t>
             </w:r>
           </w:p>
         </w:tc>
@@ -25912,7 +25962,101 @@
             <w:insideV w:val="single" w:color="auto" w:sz="4" w:space="0"/>
           </w:tblBorders>
           <w:tblCellMar>
+            <w:top w:w="0" w:type="dxa"/>
             <w:left w:w="108" w:type="dxa"/>
+            <w:bottom w:w="0" w:type="dxa"/>
+            <w:right w:w="108" w:type="dxa"/>
+          </w:tblCellMar>
+        </w:tblPrEx>
+        <w:tc>
+          <w:tcPr>
+            <w:tcW w:w="4952" w:type="dxa"/>
+            <w:vAlign w:val="center"/>
+          </w:tcPr>
+          <w:p>
+            <w:pPr>
+              <w:bidi w:val="0"/>
+            </w:pPr>
+            <w:r>
+              <w:t>Sản phẩm bán chạy</w:t>
+            </w:r>
+          </w:p>
+        </w:tc>
+        <w:tc>
+          <w:tcPr>
+            <w:tcW w:w="4953" w:type="dxa"/>
+            <w:vAlign w:val="center"/>
+          </w:tcPr>
+          <w:p>
+            <w:pPr>
+              <w:bidi w:val="0"/>
+            </w:pPr>
+            <w:r>
+              <w:t>Sản phẩm có số lượng bán cao</w:t>
+            </w:r>
+          </w:p>
+        </w:tc>
+      </w:tr>
+      <w:tr>
+        <w:tblPrEx>
+          <w:tblBorders>
+            <w:top w:val="single" w:color="auto" w:sz="4" w:space="0"/>
+            <w:left w:val="single" w:color="auto" w:sz="4" w:space="0"/>
+            <w:bottom w:val="single" w:color="auto" w:sz="4" w:space="0"/>
+            <w:right w:val="single" w:color="auto" w:sz="4" w:space="0"/>
+            <w:insideH w:val="single" w:color="auto" w:sz="4" w:space="0"/>
+            <w:insideV w:val="single" w:color="auto" w:sz="4" w:space="0"/>
+          </w:tblBorders>
+          <w:tblCellMar>
+            <w:top w:w="0" w:type="dxa"/>
+            <w:left w:w="108" w:type="dxa"/>
+            <w:bottom w:w="0" w:type="dxa"/>
+            <w:right w:w="108" w:type="dxa"/>
+          </w:tblCellMar>
+        </w:tblPrEx>
+        <w:tc>
+          <w:tcPr>
+            <w:tcW w:w="4952" w:type="dxa"/>
+            <w:vAlign w:val="center"/>
+          </w:tcPr>
+          <w:p>
+            <w:pPr>
+              <w:bidi w:val="0"/>
+            </w:pPr>
+            <w:r>
+              <w:t>Khách hàng mới</w:t>
+            </w:r>
+          </w:p>
+        </w:tc>
+        <w:tc>
+          <w:tcPr>
+            <w:tcW w:w="4953" w:type="dxa"/>
+            <w:vAlign w:val="center"/>
+          </w:tcPr>
+          <w:p>
+            <w:pPr>
+              <w:bidi w:val="0"/>
+            </w:pPr>
+            <w:r>
+              <w:t>Người dùng mới đăng ký</w:t>
+            </w:r>
+          </w:p>
+        </w:tc>
+      </w:tr>
+      <w:tr>
+        <w:tblPrEx>
+          <w:tblBorders>
+            <w:top w:val="single" w:color="auto" w:sz="4" w:space="0"/>
+            <w:left w:val="single" w:color="auto" w:sz="4" w:space="0"/>
+            <w:bottom w:val="single" w:color="auto" w:sz="4" w:space="0"/>
+            <w:right w:val="single" w:color="auto" w:sz="4" w:space="0"/>
+            <w:insideH w:val="single" w:color="auto" w:sz="4" w:space="0"/>
+            <w:insideV w:val="single" w:color="auto" w:sz="4" w:space="0"/>
+          </w:tblBorders>
+          <w:tblCellMar>
+            <w:top w:w="0" w:type="dxa"/>
+            <w:left w:w="108" w:type="dxa"/>
+            <w:bottom w:w="0" w:type="dxa"/>
             <w:right w:w="108" w:type="dxa"/>
           </w:tblCellMar>
         </w:tblPrEx>
@@ -26001,7 +26145,9 @@
         </w:tblBorders>
         <w:tblLayout w:type="autofit"/>
         <w:tblCellMar>
+          <w:top w:w="0" w:type="dxa"/>
           <w:left w:w="108" w:type="dxa"/>
+          <w:bottom w:w="0" w:type="dxa"/>
           <w:right w:w="108" w:type="dxa"/>
         </w:tblCellMar>
       </w:tblPr>
@@ -26019,6 +26165,12 @@
             <w:insideH w:val="single" w:color="auto" w:sz="4" w:space="0"/>
             <w:insideV w:val="single" w:color="auto" w:sz="4" w:space="0"/>
           </w:tblBorders>
+          <w:tblCellMar>
+            <w:top w:w="0" w:type="dxa"/>
+            <w:left w:w="108" w:type="dxa"/>
+            <w:bottom w:w="0" w:type="dxa"/>
+            <w:right w:w="108" w:type="dxa"/>
+          </w:tblCellMar>
         </w:tblPrEx>
         <w:tc>
           <w:tcPr>
@@ -26086,7 +26238,9 @@
             <w:insideV w:val="single" w:color="auto" w:sz="4" w:space="0"/>
           </w:tblBorders>
           <w:tblCellMar>
+            <w:top w:w="0" w:type="dxa"/>
             <w:left w:w="108" w:type="dxa"/>
+            <w:bottom w:w="0" w:type="dxa"/>
             <w:right w:w="108" w:type="dxa"/>
           </w:tblCellMar>
         </w:tblPrEx>
@@ -26147,7 +26301,9 @@
             <w:insideV w:val="single" w:color="auto" w:sz="4" w:space="0"/>
           </w:tblBorders>
           <w:tblCellMar>
+            <w:top w:w="0" w:type="dxa"/>
             <w:left w:w="108" w:type="dxa"/>
+            <w:bottom w:w="0" w:type="dxa"/>
             <w:right w:w="108" w:type="dxa"/>
           </w:tblCellMar>
         </w:tblPrEx>
@@ -26208,7 +26364,9 @@
             <w:insideV w:val="single" w:color="auto" w:sz="4" w:space="0"/>
           </w:tblBorders>
           <w:tblCellMar>
+            <w:top w:w="0" w:type="dxa"/>
             <w:left w:w="108" w:type="dxa"/>
+            <w:bottom w:w="0" w:type="dxa"/>
             <w:right w:w="108" w:type="dxa"/>
           </w:tblCellMar>
         </w:tblPrEx>
@@ -26269,7 +26427,9 @@
             <w:insideV w:val="single" w:color="auto" w:sz="4" w:space="0"/>
           </w:tblBorders>
           <w:tblCellMar>
+            <w:top w:w="0" w:type="dxa"/>
             <w:left w:w="108" w:type="dxa"/>
+            <w:bottom w:w="0" w:type="dxa"/>
             <w:right w:w="108" w:type="dxa"/>
           </w:tblCellMar>
         </w:tblPrEx>
@@ -27958,6 +28118,7 @@
       <w:pPr>
         <w:pStyle w:val="16"/>
         <w:numPr>
+          <w:ilvl w:val="0"/>
           <w:numId w:val="0"/>
         </w:numPr>
         <w:spacing w:before="50" w:beforeLines="50" w:after="50" w:afterLines="50" w:line="360" w:lineRule="auto"/>
@@ -28008,7 +28169,9 @@
         </w:tblBorders>
         <w:tblLayout w:type="autofit"/>
         <w:tblCellMar>
+          <w:top w:w="0" w:type="dxa"/>
           <w:left w:w="108" w:type="dxa"/>
+          <w:bottom w:w="0" w:type="dxa"/>
           <w:right w:w="108" w:type="dxa"/>
         </w:tblCellMar>
       </w:tblPr>
@@ -28027,7 +28190,9 @@
             <w:insideV w:val="single" w:color="auto" w:sz="4" w:space="0"/>
           </w:tblBorders>
           <w:tblCellMar>
+            <w:top w:w="0" w:type="dxa"/>
             <w:left w:w="108" w:type="dxa"/>
+            <w:bottom w:w="0" w:type="dxa"/>
             <w:right w:w="108" w:type="dxa"/>
           </w:tblCellMar>
         </w:tblPrEx>
@@ -28095,7 +28260,9 @@
             <w:insideV w:val="single" w:color="auto" w:sz="4" w:space="0"/>
           </w:tblBorders>
           <w:tblCellMar>
+            <w:top w:w="0" w:type="dxa"/>
             <w:left w:w="108" w:type="dxa"/>
+            <w:bottom w:w="0" w:type="dxa"/>
             <w:right w:w="108" w:type="dxa"/>
           </w:tblCellMar>
         </w:tblPrEx>
@@ -28151,7 +28318,9 @@
             <w:insideV w:val="single" w:color="auto" w:sz="4" w:space="0"/>
           </w:tblBorders>
           <w:tblCellMar>
+            <w:top w:w="0" w:type="dxa"/>
             <w:left w:w="108" w:type="dxa"/>
+            <w:bottom w:w="0" w:type="dxa"/>
             <w:right w:w="108" w:type="dxa"/>
           </w:tblCellMar>
         </w:tblPrEx>
@@ -28207,7 +28376,9 @@
             <w:insideV w:val="single" w:color="auto" w:sz="4" w:space="0"/>
           </w:tblBorders>
           <w:tblCellMar>
+            <w:top w:w="0" w:type="dxa"/>
             <w:left w:w="108" w:type="dxa"/>
+            <w:bottom w:w="0" w:type="dxa"/>
             <w:right w:w="108" w:type="dxa"/>
           </w:tblCellMar>
         </w:tblPrEx>
@@ -28263,7 +28434,9 @@
             <w:insideV w:val="single" w:color="auto" w:sz="4" w:space="0"/>
           </w:tblBorders>
           <w:tblCellMar>
+            <w:top w:w="0" w:type="dxa"/>
             <w:left w:w="108" w:type="dxa"/>
+            <w:bottom w:w="0" w:type="dxa"/>
             <w:right w:w="108" w:type="dxa"/>
           </w:tblCellMar>
         </w:tblPrEx>
@@ -28319,7 +28492,9 @@
             <w:insideV w:val="single" w:color="auto" w:sz="4" w:space="0"/>
           </w:tblBorders>
           <w:tblCellMar>
+            <w:top w:w="0" w:type="dxa"/>
             <w:left w:w="108" w:type="dxa"/>
+            <w:bottom w:w="0" w:type="dxa"/>
             <w:right w:w="108" w:type="dxa"/>
           </w:tblCellMar>
         </w:tblPrEx>
@@ -28375,7 +28550,9 @@
             <w:insideV w:val="single" w:color="auto" w:sz="4" w:space="0"/>
           </w:tblBorders>
           <w:tblCellMar>
+            <w:top w:w="0" w:type="dxa"/>
             <w:left w:w="108" w:type="dxa"/>
+            <w:bottom w:w="0" w:type="dxa"/>
             <w:right w:w="108" w:type="dxa"/>
           </w:tblCellMar>
         </w:tblPrEx>
@@ -28431,7 +28608,9 @@
             <w:insideV w:val="single" w:color="auto" w:sz="4" w:space="0"/>
           </w:tblBorders>
           <w:tblCellMar>
+            <w:top w:w="0" w:type="dxa"/>
             <w:left w:w="108" w:type="dxa"/>
+            <w:bottom w:w="0" w:type="dxa"/>
             <w:right w:w="108" w:type="dxa"/>
           </w:tblCellMar>
         </w:tblPrEx>
@@ -28566,6 +28745,7 @@
       <w:pPr>
         <w:pStyle w:val="16"/>
         <w:numPr>
+          <w:ilvl w:val="0"/>
           <w:numId w:val="0"/>
         </w:numPr>
         <w:spacing w:before="50" w:beforeLines="50" w:after="50" w:afterLines="50" w:line="360" w:lineRule="auto"/>
@@ -28616,7 +28796,9 @@
         </w:tblBorders>
         <w:tblLayout w:type="autofit"/>
         <w:tblCellMar>
+          <w:top w:w="0" w:type="dxa"/>
           <w:left w:w="108" w:type="dxa"/>
+          <w:bottom w:w="0" w:type="dxa"/>
           <w:right w:w="108" w:type="dxa"/>
         </w:tblCellMar>
       </w:tblPr>
@@ -28635,7 +28817,9 @@
             <w:insideV w:val="single" w:color="auto" w:sz="4" w:space="0"/>
           </w:tblBorders>
           <w:tblCellMar>
+            <w:top w:w="0" w:type="dxa"/>
             <w:left w:w="108" w:type="dxa"/>
+            <w:bottom w:w="0" w:type="dxa"/>
             <w:right w:w="108" w:type="dxa"/>
           </w:tblCellMar>
         </w:tblPrEx>
@@ -28703,7 +28887,9 @@
             <w:insideV w:val="single" w:color="auto" w:sz="4" w:space="0"/>
           </w:tblBorders>
           <w:tblCellMar>
+            <w:top w:w="0" w:type="dxa"/>
             <w:left w:w="108" w:type="dxa"/>
+            <w:bottom w:w="0" w:type="dxa"/>
             <w:right w:w="108" w:type="dxa"/>
           </w:tblCellMar>
         </w:tblPrEx>
@@ -28759,7 +28945,9 @@
             <w:insideV w:val="single" w:color="auto" w:sz="4" w:space="0"/>
           </w:tblBorders>
           <w:tblCellMar>
+            <w:top w:w="0" w:type="dxa"/>
             <w:left w:w="108" w:type="dxa"/>
+            <w:bottom w:w="0" w:type="dxa"/>
             <w:right w:w="108" w:type="dxa"/>
           </w:tblCellMar>
         </w:tblPrEx>
@@ -28815,7 +29003,9 @@
             <w:insideV w:val="single" w:color="auto" w:sz="4" w:space="0"/>
           </w:tblBorders>
           <w:tblCellMar>
+            <w:top w:w="0" w:type="dxa"/>
             <w:left w:w="108" w:type="dxa"/>
+            <w:bottom w:w="0" w:type="dxa"/>
             <w:right w:w="108" w:type="dxa"/>
           </w:tblCellMar>
         </w:tblPrEx>
@@ -28871,7 +29061,9 @@
             <w:insideV w:val="single" w:color="auto" w:sz="4" w:space="0"/>
           </w:tblBorders>
           <w:tblCellMar>
+            <w:top w:w="0" w:type="dxa"/>
             <w:left w:w="108" w:type="dxa"/>
+            <w:bottom w:w="0" w:type="dxa"/>
             <w:right w:w="108" w:type="dxa"/>
           </w:tblCellMar>
         </w:tblPrEx>
@@ -29558,7 +29750,9 @@
         </w:tblBorders>
         <w:tblLayout w:type="autofit"/>
         <w:tblCellMar>
+          <w:top w:w="0" w:type="dxa"/>
           <w:left w:w="108" w:type="dxa"/>
+          <w:bottom w:w="0" w:type="dxa"/>
           <w:right w:w="108" w:type="dxa"/>
         </w:tblCellMar>
       </w:tblPr>
@@ -29577,7 +29771,9 @@
             <w:insideV w:val="single" w:color="auto" w:sz="4" w:space="0"/>
           </w:tblBorders>
           <w:tblCellMar>
+            <w:top w:w="0" w:type="dxa"/>
             <w:left w:w="108" w:type="dxa"/>
+            <w:bottom w:w="0" w:type="dxa"/>
             <w:right w:w="108" w:type="dxa"/>
           </w:tblCellMar>
         </w:tblPrEx>
@@ -29643,7 +29839,9 @@
             <w:insideV w:val="single" w:color="auto" w:sz="4" w:space="0"/>
           </w:tblBorders>
           <w:tblCellMar>
+            <w:top w:w="0" w:type="dxa"/>
             <w:left w:w="108" w:type="dxa"/>
+            <w:bottom w:w="0" w:type="dxa"/>
             <w:right w:w="108" w:type="dxa"/>
           </w:tblCellMar>
         </w:tblPrEx>
@@ -29695,7 +29893,9 @@
             <w:insideV w:val="single" w:color="auto" w:sz="4" w:space="0"/>
           </w:tblBorders>
           <w:tblCellMar>
+            <w:top w:w="0" w:type="dxa"/>
             <w:left w:w="108" w:type="dxa"/>
+            <w:bottom w:w="0" w:type="dxa"/>
             <w:right w:w="108" w:type="dxa"/>
           </w:tblCellMar>
         </w:tblPrEx>
@@ -29747,7 +29947,9 @@
             <w:insideV w:val="single" w:color="auto" w:sz="4" w:space="0"/>
           </w:tblBorders>
           <w:tblCellMar>
+            <w:top w:w="0" w:type="dxa"/>
             <w:left w:w="108" w:type="dxa"/>
+            <w:bottom w:w="0" w:type="dxa"/>
             <w:right w:w="108" w:type="dxa"/>
           </w:tblCellMar>
         </w:tblPrEx>
@@ -29799,7 +30001,9 @@
             <w:insideV w:val="single" w:color="auto" w:sz="4" w:space="0"/>
           </w:tblBorders>
           <w:tblCellMar>
+            <w:top w:w="0" w:type="dxa"/>
             <w:left w:w="108" w:type="dxa"/>
+            <w:bottom w:w="0" w:type="dxa"/>
             <w:right w:w="108" w:type="dxa"/>
           </w:tblCellMar>
         </w:tblPrEx>
@@ -29851,7 +30055,9 @@
             <w:insideV w:val="single" w:color="auto" w:sz="4" w:space="0"/>
           </w:tblBorders>
           <w:tblCellMar>
+            <w:top w:w="0" w:type="dxa"/>
             <w:left w:w="108" w:type="dxa"/>
+            <w:bottom w:w="0" w:type="dxa"/>
             <w:right w:w="108" w:type="dxa"/>
           </w:tblCellMar>
         </w:tblPrEx>
@@ -29903,7 +30109,9 @@
             <w:insideV w:val="single" w:color="auto" w:sz="4" w:space="0"/>
           </w:tblBorders>
           <w:tblCellMar>
+            <w:top w:w="0" w:type="dxa"/>
             <w:left w:w="108" w:type="dxa"/>
+            <w:bottom w:w="0" w:type="dxa"/>
             <w:right w:w="108" w:type="dxa"/>
           </w:tblCellMar>
         </w:tblPrEx>
@@ -29955,7 +30163,9 @@
             <w:insideV w:val="single" w:color="auto" w:sz="4" w:space="0"/>
           </w:tblBorders>
           <w:tblCellMar>
+            <w:top w:w="0" w:type="dxa"/>
             <w:left w:w="108" w:type="dxa"/>
+            <w:bottom w:w="0" w:type="dxa"/>
             <w:right w:w="108" w:type="dxa"/>
           </w:tblCellMar>
         </w:tblPrEx>
@@ -29999,7 +30209,9 @@
             <w:insideV w:val="single" w:color="auto" w:sz="4" w:space="0"/>
           </w:tblBorders>
           <w:tblCellMar>
+            <w:top w:w="0" w:type="dxa"/>
             <w:left w:w="108" w:type="dxa"/>
+            <w:bottom w:w="0" w:type="dxa"/>
             <w:right w:w="108" w:type="dxa"/>
           </w:tblCellMar>
         </w:tblPrEx>

</xml_diff>